<commit_message>
fix ci and cd
</commit_message>
<xml_diff>
--- a/docs/WORK_REPORT_DEAL_INIT_RECOVERY.docx
+++ b/docs/WORK_REPORT_DEAL_INIT_RECOVERY.docx
@@ -108,7 +108,7 @@
           <w:sz w:val="22"/>
           <w:szCs w:val="22"/>
         </w:rPr>
-        <w:pict w14:anchorId="5023CFC9">
+        <w:pict w14:anchorId="3DFB74DF">
           <v:rect id="_x0000_i1025" style="width:0;height:1.5pt" o:hralign="center" o:hrstd="t" o:hr="t" fillcolor="#a0a0a0" stroked="f"/>
         </w:pict>
       </w:r>
@@ -836,7 +836,7 @@
           <w:sz w:val="22"/>
           <w:szCs w:val="22"/>
         </w:rPr>
-        <w:t>Дата отсечки задана константой в коде и должна совпадать с датой публикации обновления (сейчас — 8 сентября 2026). Если публикация сдвинется, константу нужно поправить.</w:t>
+        <w:t>Дата отсечки задана константой в коде и должна совпадать с датой публикации обновления (сейчас — полночь 8 сентября 2026 по новосибирскому времени). Если публикация сдвинется, константу нужно поправить.</w:t>
       </w:r>
     </w:p>
     <w:p>
@@ -1363,6 +1363,7 @@
         <w:rPr>
           <w:rFonts w:ascii="Calibri" w:eastAsia="Times New Roman" w:hAnsi="Calibri" w:cs="Calibri"/>
         </w:rPr>
+        <w:lastRenderedPageBreak/>
         <w:t>3. Проверки</w:t>
       </w:r>
     </w:p>
@@ -1422,7 +1423,6 @@
                 <w:sz w:val="22"/>
                 <w:szCs w:val="22"/>
               </w:rPr>
-              <w:lastRenderedPageBreak/>
               <w:t>Проверка</w:t>
             </w:r>
           </w:p>
@@ -1752,7 +1752,7 @@
                 <w:sz w:val="22"/>
                 <w:szCs w:val="22"/>
               </w:rPr>
-              <w:t>67 из 67 пройдено (14 новых)</w:t>
+              <w:t>75 из 75 пройдено (22 новых)</w:t>
             </w:r>
           </w:p>
         </w:tc>
@@ -1917,7 +1917,7 @@
           <w:sz w:val="22"/>
           <w:szCs w:val="22"/>
         </w:rPr>
-        <w:t>Новыми тестами покрыты правила отбора: подходящая сделка; чужая воронка; сделка, ушедшая дальше «Заявки»; проставленный признак; слишком свежая; ровно на границе свежести; старше глубины; ровно на границе глубины; созданная до выката признака; битая дата; категория строкой; настройка границ окна.</w:t>
+        <w:t>Новыми тестами покрыты правила отбора: подходящая сделка; чужая воронка; сделка, ушедшая дальше «Заявки»; проставленный признак; слишком свежая; ровно на границе свежести; старше глубины; ровно на границе глубины; созданная до выката признака; битая дата; категория строкой; настройка границ окна. Отдельно покрыт расчет календарной даты по новосибирскому времени, включая ночные часы, когда дата на сервере еще предыдущая, и переходы через границы месяца и года.</w:t>
       </w:r>
     </w:p>
     <w:p>
@@ -2761,42 +2761,42 @@
                 <w:sz w:val="22"/>
                 <w:szCs w:val="22"/>
               </w:rPr>
-              <w:t>Сборки, проверки типов, статический анализ, прогон тестов</w:t>
-            </w:r>
-          </w:p>
-        </w:tc>
-        <w:tc>
-          <w:tcPr>
-            <w:tcW w:w="0" w:type="auto"/>
-            <w:tcBorders>
-              <w:top w:val="single" w:sz="6" w:space="0" w:color="999999"/>
-              <w:left w:val="single" w:sz="6" w:space="0" w:color="999999"/>
-              <w:bottom w:val="single" w:sz="6" w:space="0" w:color="999999"/>
-              <w:right w:val="single" w:sz="6" w:space="0" w:color="999999"/>
-            </w:tcBorders>
-            <w:tcMar>
-              <w:top w:w="60" w:type="dxa"/>
-              <w:left w:w="120" w:type="dxa"/>
-              <w:bottom w:w="60" w:type="dxa"/>
-              <w:right w:w="120" w:type="dxa"/>
-            </w:tcMar>
-            <w:hideMark/>
-          </w:tcPr>
-          <w:p>
-            <w:pPr>
-              <w:rPr>
-                <w:rFonts w:ascii="Calibri" w:eastAsia="Times New Roman" w:hAnsi="Calibri" w:cs="Calibri"/>
-                <w:sz w:val="22"/>
-                <w:szCs w:val="22"/>
-              </w:rPr>
-            </w:pPr>
-            <w:r>
-              <w:rPr>
-                <w:rFonts w:ascii="Calibri" w:eastAsia="Times New Roman" w:hAnsi="Calibri" w:cs="Calibri"/>
-                <w:sz w:val="22"/>
-                <w:szCs w:val="22"/>
-              </w:rPr>
-              <w:t>0,5</w:t>
+              <w:t>Приведение расписаний и календарных дат к новосибирскому времени, тесты</w:t>
+            </w:r>
+          </w:p>
+        </w:tc>
+        <w:tc>
+          <w:tcPr>
+            <w:tcW w:w="0" w:type="auto"/>
+            <w:tcBorders>
+              <w:top w:val="single" w:sz="6" w:space="0" w:color="999999"/>
+              <w:left w:val="single" w:sz="6" w:space="0" w:color="999999"/>
+              <w:bottom w:val="single" w:sz="6" w:space="0" w:color="999999"/>
+              <w:right w:val="single" w:sz="6" w:space="0" w:color="999999"/>
+            </w:tcBorders>
+            <w:tcMar>
+              <w:top w:w="60" w:type="dxa"/>
+              <w:left w:w="120" w:type="dxa"/>
+              <w:bottom w:w="60" w:type="dxa"/>
+              <w:right w:w="120" w:type="dxa"/>
+            </w:tcMar>
+            <w:hideMark/>
+          </w:tcPr>
+          <w:p>
+            <w:pPr>
+              <w:rPr>
+                <w:rFonts w:ascii="Calibri" w:eastAsia="Times New Roman" w:hAnsi="Calibri" w:cs="Calibri"/>
+                <w:sz w:val="22"/>
+                <w:szCs w:val="22"/>
+              </w:rPr>
+            </w:pPr>
+            <w:r>
+              <w:rPr>
+                <w:rFonts w:ascii="Calibri" w:eastAsia="Times New Roman" w:hAnsi="Calibri" w:cs="Calibri"/>
+                <w:sz w:val="22"/>
+                <w:szCs w:val="22"/>
+              </w:rPr>
+              <w:t>1,0</w:t>
             </w:r>
           </w:p>
         </w:tc>
@@ -2829,6 +2829,78 @@
             </w:pPr>
             <w:r>
               <w:rPr>
+                <w:rFonts w:ascii="Calibri" w:eastAsia="Times New Roman" w:hAnsi="Calibri" w:cs="Calibri"/>
+                <w:sz w:val="22"/>
+                <w:szCs w:val="22"/>
+              </w:rPr>
+              <w:t>Сборки, проверки типов, статический анализ, прогон тестов</w:t>
+            </w:r>
+          </w:p>
+        </w:tc>
+        <w:tc>
+          <w:tcPr>
+            <w:tcW w:w="0" w:type="auto"/>
+            <w:tcBorders>
+              <w:top w:val="single" w:sz="6" w:space="0" w:color="999999"/>
+              <w:left w:val="single" w:sz="6" w:space="0" w:color="999999"/>
+              <w:bottom w:val="single" w:sz="6" w:space="0" w:color="999999"/>
+              <w:right w:val="single" w:sz="6" w:space="0" w:color="999999"/>
+            </w:tcBorders>
+            <w:tcMar>
+              <w:top w:w="60" w:type="dxa"/>
+              <w:left w:w="120" w:type="dxa"/>
+              <w:bottom w:w="60" w:type="dxa"/>
+              <w:right w:w="120" w:type="dxa"/>
+            </w:tcMar>
+            <w:hideMark/>
+          </w:tcPr>
+          <w:p>
+            <w:pPr>
+              <w:rPr>
+                <w:rFonts w:ascii="Calibri" w:eastAsia="Times New Roman" w:hAnsi="Calibri" w:cs="Calibri"/>
+                <w:sz w:val="22"/>
+                <w:szCs w:val="22"/>
+              </w:rPr>
+            </w:pPr>
+            <w:r>
+              <w:rPr>
+                <w:rFonts w:ascii="Calibri" w:eastAsia="Times New Roman" w:hAnsi="Calibri" w:cs="Calibri"/>
+                <w:sz w:val="22"/>
+                <w:szCs w:val="22"/>
+              </w:rPr>
+              <w:t>0,5</w:t>
+            </w:r>
+          </w:p>
+        </w:tc>
+      </w:tr>
+      <w:tr>
+        <w:tc>
+          <w:tcPr>
+            <w:tcW w:w="0" w:type="auto"/>
+            <w:tcBorders>
+              <w:top w:val="single" w:sz="6" w:space="0" w:color="999999"/>
+              <w:left w:val="single" w:sz="6" w:space="0" w:color="999999"/>
+              <w:bottom w:val="single" w:sz="6" w:space="0" w:color="999999"/>
+              <w:right w:val="single" w:sz="6" w:space="0" w:color="999999"/>
+            </w:tcBorders>
+            <w:tcMar>
+              <w:top w:w="60" w:type="dxa"/>
+              <w:left w:w="120" w:type="dxa"/>
+              <w:bottom w:w="60" w:type="dxa"/>
+              <w:right w:w="120" w:type="dxa"/>
+            </w:tcMar>
+            <w:hideMark/>
+          </w:tcPr>
+          <w:p>
+            <w:pPr>
+              <w:rPr>
+                <w:rFonts w:ascii="Calibri" w:eastAsia="Times New Roman" w:hAnsi="Calibri" w:cs="Calibri"/>
+                <w:sz w:val="22"/>
+                <w:szCs w:val="22"/>
+              </w:rPr>
+            </w:pPr>
+            <w:r>
+              <w:rPr>
                 <w:rStyle w:val="a4"/>
                 <w:rFonts w:ascii="Calibri" w:eastAsia="Times New Roman" w:hAnsi="Calibri" w:cs="Calibri"/>
                 <w:sz w:val="22"/>
@@ -2870,7 +2942,7 @@
                 <w:sz w:val="22"/>
                 <w:szCs w:val="22"/>
               </w:rPr>
-              <w:t>7,5</w:t>
+              <w:t>8,5</w:t>
             </w:r>
           </w:p>
         </w:tc>
@@ -2907,122 +2979,9 @@
 <file path=word/numbering.xml><?xml version="1.0" encoding="utf-8"?>
 <w:numbering xmlns:wpc="http://schemas.microsoft.com/office/word/2010/wordprocessingCanvas" xmlns:cx="http://schemas.microsoft.com/office/drawing/2014/chartex" xmlns:cx1="http://schemas.microsoft.com/office/drawing/2015/9/8/chartex" xmlns:cx2="http://schemas.microsoft.com/office/drawing/2015/10/21/chartex" xmlns:cx3="http://schemas.microsoft.com/office/drawing/2016/5/9/chartex" xmlns:cx4="http://schemas.microsoft.com/office/drawing/2016/5/10/chartex" xmlns:cx5="http://schemas.microsoft.com/office/drawing/2016/5/11/chartex" xmlns:cx6="http://schemas.microsoft.com/office/drawing/2016/5/12/chartex" xmlns:cx7="http://schemas.microsoft.com/office/drawing/2016/5/13/chartex" xmlns:cx8="http://schemas.microsoft.com/office/drawing/2016/5/14/chartex" xmlns:mc="http://schemas.openxmlformats.org/markup-compatibility/2006" xmlns:aink="http://schemas.microsoft.com/office/drawing/2016/ink" xmlns:am3d="http://schemas.microsoft.com/office/drawing/2017/model3d" xmlns:o="urn:schemas-microsoft-com:office:office" xmlns:oel="http://schemas.microsoft.com/office/2019/extlst" xmlns:r="http://schemas.openxmlformats.org/officeDocument/2006/relationships" xmlns:m="http://schemas.openxmlformats.org/officeDocument/2006/math" xmlns:v="urn:schemas-microsoft-com:vml" xmlns:wp14="http://schemas.microsoft.com/office/word/2010/wordprocessingDrawing" xmlns:wp="http://schemas.openxmlformats.org/drawingml/2006/wordprocessingDrawing" xmlns:w10="urn:schemas-microsoft-com:office:word" xmlns:w="http://schemas.openxmlformats.org/wordprocessingml/2006/main" xmlns:w14="http://schemas.microsoft.com/office/word/2010/wordml" xmlns:w15="http://schemas.microsoft.com/office/word/2012/wordml" xmlns:w16cex="http://schemas.microsoft.com/office/word/2018/wordml/cex" xmlns:w16cid="http://schemas.microsoft.com/office/word/2016/wordml/cid" xmlns:w16="http://schemas.microsoft.com/office/word/2018/wordml" xmlns:w16du="http://schemas.microsoft.com/office/word/2023/wordml/word16du" xmlns:w16sdtdh="http://schemas.microsoft.com/office/word/2020/wordml/sdtdatahash" xmlns:w16sdtfl="http://schemas.microsoft.com/office/word/2024/wordml/sdtformatlock" xmlns:w16se="http://schemas.microsoft.com/office/word/2015/wordml/symex" xmlns:wpg="http://schemas.microsoft.com/office/word/2010/wordprocessingGroup" xmlns:wpi="http://schemas.microsoft.com/office/word/2010/wordprocessingInk" xmlns:wne="http://schemas.microsoft.com/office/word/2006/wordml" xmlns:wps="http://schemas.microsoft.com/office/word/2010/wordprocessingShape" mc:Ignorable="w14 w15 w16se w16cid w16 w16cex w16sdtdh w16sdtfl w16du wp14">
   <w:abstractNum w:abstractNumId="0" w15:restartNumberingAfterBreak="0">
-    <w:nsid w:val="35F11B26"/>
+    <w:nsid w:val="40E5425E"/>
     <w:multiLevelType w:val="multilevel"/>
-    <w:tmpl w:val="A7001816"/>
-    <w:lvl w:ilvl="0">
-      <w:start w:val="1"/>
-      <w:numFmt w:val="decimal"/>
-      <w:lvlText w:val="%1."/>
-      <w:lvlJc w:val="left"/>
-      <w:pPr>
-        <w:tabs>
-          <w:tab w:val="num" w:pos="720"/>
-        </w:tabs>
-        <w:ind w:left="720" w:hanging="360"/>
-      </w:pPr>
-    </w:lvl>
-    <w:lvl w:ilvl="1" w:tentative="1">
-      <w:start w:val="1"/>
-      <w:numFmt w:val="decimal"/>
-      <w:lvlText w:val="%2."/>
-      <w:lvlJc w:val="left"/>
-      <w:pPr>
-        <w:tabs>
-          <w:tab w:val="num" w:pos="1440"/>
-        </w:tabs>
-        <w:ind w:left="1440" w:hanging="360"/>
-      </w:pPr>
-    </w:lvl>
-    <w:lvl w:ilvl="2" w:tentative="1">
-      <w:start w:val="1"/>
-      <w:numFmt w:val="decimal"/>
-      <w:lvlText w:val="%3."/>
-      <w:lvlJc w:val="left"/>
-      <w:pPr>
-        <w:tabs>
-          <w:tab w:val="num" w:pos="2160"/>
-        </w:tabs>
-        <w:ind w:left="2160" w:hanging="360"/>
-      </w:pPr>
-    </w:lvl>
-    <w:lvl w:ilvl="3" w:tentative="1">
-      <w:start w:val="1"/>
-      <w:numFmt w:val="decimal"/>
-      <w:lvlText w:val="%4."/>
-      <w:lvlJc w:val="left"/>
-      <w:pPr>
-        <w:tabs>
-          <w:tab w:val="num" w:pos="2880"/>
-        </w:tabs>
-        <w:ind w:left="2880" w:hanging="360"/>
-      </w:pPr>
-    </w:lvl>
-    <w:lvl w:ilvl="4" w:tentative="1">
-      <w:start w:val="1"/>
-      <w:numFmt w:val="decimal"/>
-      <w:lvlText w:val="%5."/>
-      <w:lvlJc w:val="left"/>
-      <w:pPr>
-        <w:tabs>
-          <w:tab w:val="num" w:pos="3600"/>
-        </w:tabs>
-        <w:ind w:left="3600" w:hanging="360"/>
-      </w:pPr>
-    </w:lvl>
-    <w:lvl w:ilvl="5" w:tentative="1">
-      <w:start w:val="1"/>
-      <w:numFmt w:val="decimal"/>
-      <w:lvlText w:val="%6."/>
-      <w:lvlJc w:val="left"/>
-      <w:pPr>
-        <w:tabs>
-          <w:tab w:val="num" w:pos="4320"/>
-        </w:tabs>
-        <w:ind w:left="4320" w:hanging="360"/>
-      </w:pPr>
-    </w:lvl>
-    <w:lvl w:ilvl="6" w:tentative="1">
-      <w:start w:val="1"/>
-      <w:numFmt w:val="decimal"/>
-      <w:lvlText w:val="%7."/>
-      <w:lvlJc w:val="left"/>
-      <w:pPr>
-        <w:tabs>
-          <w:tab w:val="num" w:pos="5040"/>
-        </w:tabs>
-        <w:ind w:left="5040" w:hanging="360"/>
-      </w:pPr>
-    </w:lvl>
-    <w:lvl w:ilvl="7" w:tentative="1">
-      <w:start w:val="1"/>
-      <w:numFmt w:val="decimal"/>
-      <w:lvlText w:val="%8."/>
-      <w:lvlJc w:val="left"/>
-      <w:pPr>
-        <w:tabs>
-          <w:tab w:val="num" w:pos="5760"/>
-        </w:tabs>
-        <w:ind w:left="5760" w:hanging="360"/>
-      </w:pPr>
-    </w:lvl>
-    <w:lvl w:ilvl="8" w:tentative="1">
-      <w:start w:val="1"/>
-      <w:numFmt w:val="decimal"/>
-      <w:lvlText w:val="%9."/>
-      <w:lvlJc w:val="left"/>
-      <w:pPr>
-        <w:tabs>
-          <w:tab w:val="num" w:pos="6480"/>
-        </w:tabs>
-        <w:ind w:left="6480" w:hanging="360"/>
-      </w:pPr>
-    </w:lvl>
-  </w:abstractNum>
-  <w:abstractNum w:abstractNumId="1" w15:restartNumberingAfterBreak="0">
-    <w:nsid w:val="384871D2"/>
-    <w:multiLevelType w:val="multilevel"/>
-    <w:tmpl w:val="B3205DAE"/>
+    <w:tmpl w:val="A33E1EF0"/>
     <w:lvl w:ilvl="0">
       <w:start w:val="1"/>
       <w:numFmt w:val="bullet"/>
@@ -3168,10 +3127,10 @@
       </w:rPr>
     </w:lvl>
   </w:abstractNum>
-  <w:abstractNum w:abstractNumId="2" w15:restartNumberingAfterBreak="0">
-    <w:nsid w:val="756B59CE"/>
+  <w:abstractNum w:abstractNumId="1" w15:restartNumberingAfterBreak="0">
+    <w:nsid w:val="445A7A2A"/>
     <w:multiLevelType w:val="multilevel"/>
-    <w:tmpl w:val="EDB0386C"/>
+    <w:tmpl w:val="CA744DD4"/>
     <w:lvl w:ilvl="0">
       <w:start w:val="1"/>
       <w:numFmt w:val="bullet"/>
@@ -3317,14 +3276,127 @@
       </w:rPr>
     </w:lvl>
   </w:abstractNum>
-  <w:num w:numId="1" w16cid:durableId="891427268">
-    <w:abstractNumId w:val="0"/>
+  <w:abstractNum w:abstractNumId="2" w15:restartNumberingAfterBreak="0">
+    <w:nsid w:val="7EF723FF"/>
+    <w:multiLevelType w:val="multilevel"/>
+    <w:tmpl w:val="5B5EB4BA"/>
+    <w:lvl w:ilvl="0">
+      <w:start w:val="1"/>
+      <w:numFmt w:val="decimal"/>
+      <w:lvlText w:val="%1."/>
+      <w:lvlJc w:val="left"/>
+      <w:pPr>
+        <w:tabs>
+          <w:tab w:val="num" w:pos="720"/>
+        </w:tabs>
+        <w:ind w:left="720" w:hanging="360"/>
+      </w:pPr>
+    </w:lvl>
+    <w:lvl w:ilvl="1" w:tentative="1">
+      <w:start w:val="1"/>
+      <w:numFmt w:val="decimal"/>
+      <w:lvlText w:val="%2."/>
+      <w:lvlJc w:val="left"/>
+      <w:pPr>
+        <w:tabs>
+          <w:tab w:val="num" w:pos="1440"/>
+        </w:tabs>
+        <w:ind w:left="1440" w:hanging="360"/>
+      </w:pPr>
+    </w:lvl>
+    <w:lvl w:ilvl="2" w:tentative="1">
+      <w:start w:val="1"/>
+      <w:numFmt w:val="decimal"/>
+      <w:lvlText w:val="%3."/>
+      <w:lvlJc w:val="left"/>
+      <w:pPr>
+        <w:tabs>
+          <w:tab w:val="num" w:pos="2160"/>
+        </w:tabs>
+        <w:ind w:left="2160" w:hanging="360"/>
+      </w:pPr>
+    </w:lvl>
+    <w:lvl w:ilvl="3" w:tentative="1">
+      <w:start w:val="1"/>
+      <w:numFmt w:val="decimal"/>
+      <w:lvlText w:val="%4."/>
+      <w:lvlJc w:val="left"/>
+      <w:pPr>
+        <w:tabs>
+          <w:tab w:val="num" w:pos="2880"/>
+        </w:tabs>
+        <w:ind w:left="2880" w:hanging="360"/>
+      </w:pPr>
+    </w:lvl>
+    <w:lvl w:ilvl="4" w:tentative="1">
+      <w:start w:val="1"/>
+      <w:numFmt w:val="decimal"/>
+      <w:lvlText w:val="%5."/>
+      <w:lvlJc w:val="left"/>
+      <w:pPr>
+        <w:tabs>
+          <w:tab w:val="num" w:pos="3600"/>
+        </w:tabs>
+        <w:ind w:left="3600" w:hanging="360"/>
+      </w:pPr>
+    </w:lvl>
+    <w:lvl w:ilvl="5" w:tentative="1">
+      <w:start w:val="1"/>
+      <w:numFmt w:val="decimal"/>
+      <w:lvlText w:val="%6."/>
+      <w:lvlJc w:val="left"/>
+      <w:pPr>
+        <w:tabs>
+          <w:tab w:val="num" w:pos="4320"/>
+        </w:tabs>
+        <w:ind w:left="4320" w:hanging="360"/>
+      </w:pPr>
+    </w:lvl>
+    <w:lvl w:ilvl="6" w:tentative="1">
+      <w:start w:val="1"/>
+      <w:numFmt w:val="decimal"/>
+      <w:lvlText w:val="%7."/>
+      <w:lvlJc w:val="left"/>
+      <w:pPr>
+        <w:tabs>
+          <w:tab w:val="num" w:pos="5040"/>
+        </w:tabs>
+        <w:ind w:left="5040" w:hanging="360"/>
+      </w:pPr>
+    </w:lvl>
+    <w:lvl w:ilvl="7" w:tentative="1">
+      <w:start w:val="1"/>
+      <w:numFmt w:val="decimal"/>
+      <w:lvlText w:val="%8."/>
+      <w:lvlJc w:val="left"/>
+      <w:pPr>
+        <w:tabs>
+          <w:tab w:val="num" w:pos="5760"/>
+        </w:tabs>
+        <w:ind w:left="5760" w:hanging="360"/>
+      </w:pPr>
+    </w:lvl>
+    <w:lvl w:ilvl="8" w:tentative="1">
+      <w:start w:val="1"/>
+      <w:numFmt w:val="decimal"/>
+      <w:lvlText w:val="%9."/>
+      <w:lvlJc w:val="left"/>
+      <w:pPr>
+        <w:tabs>
+          <w:tab w:val="num" w:pos="6480"/>
+        </w:tabs>
+        <w:ind w:left="6480" w:hanging="360"/>
+      </w:pPr>
+    </w:lvl>
+  </w:abstractNum>
+  <w:num w:numId="1" w16cid:durableId="1791849971">
+    <w:abstractNumId w:val="2"/>
   </w:num>
-  <w:num w:numId="2" w16cid:durableId="618223147">
+  <w:num w:numId="2" w16cid:durableId="310839764">
     <w:abstractNumId w:val="1"/>
   </w:num>
-  <w:num w:numId="3" w16cid:durableId="1791776771">
-    <w:abstractNumId w:val="2"/>
+  <w:num w:numId="3" w16cid:durableId="498927086">
+    <w:abstractNumId w:val="0"/>
   </w:num>
 </w:numbering>
 </file>

</xml_diff>